<commit_message>
Deployed 6bcd1681 with MkDocs version: 1.6.1
</commit_message>
<xml_diff>
--- a/download/service_providing_group.docx
+++ b/download/service_providing_group.docx
@@ -794,6 +794,52 @@
               <w:pStyle w:val="Compact"/>
             </w:pPr>
             <w:r>
+              <w:t xml:space="preserve">created_at</w:t>
+            </w:r>
+          </w:p>
+        </w:tc>
+        <w:tc>
+          <w:tcPr/>
+          <w:p>
+            <w:pPr>
+              <w:pStyle w:val="Compact"/>
+            </w:pPr>
+            <w:r>
+              <w:t xml:space="preserve">When the service providing group was first created.</w:t>
+            </w:r>
+          </w:p>
+        </w:tc>
+        <w:tc>
+          <w:tcPr/>
+          <w:p>
+            <w:pPr>
+              <w:pStyle w:val="Compact"/>
+            </w:pPr>
+            <w:r>
+              <w:t xml:space="preserve">date-time</w:t>
+            </w:r>
+            <w:r>
+              <w:t xml:space="preserve">Read only</w:t>
+            </w:r>
+          </w:p>
+        </w:tc>
+        <w:tc>
+          <w:tcPr/>
+          <w:p>
+            <w:pPr>
+              <w:pStyle w:val="Compact"/>
+            </w:pPr>
+          </w:p>
+        </w:tc>
+      </w:tr>
+      <w:tr>
+        <w:tc>
+          <w:tcPr/>
+          <w:p>
+            <w:pPr>
+              <w:pStyle w:val="Compact"/>
+            </w:pPr>
+            <w:r>
               <w:t xml:space="preserve">recorded_at</w:t>
             </w:r>
           </w:p>
@@ -2616,6 +2662,112 @@
             </w:pPr>
             <w:r>
               <w:t xml:space="preserve">recorded_by</w:t>
+            </w:r>
+          </w:p>
+        </w:tc>
+        <w:tc>
+          <w:tcPr/>
+          <w:p>
+            <w:pPr>
+              <w:pStyle w:val="Compact"/>
+            </w:pPr>
+          </w:p>
+        </w:tc>
+        <w:tc>
+          <w:tcPr/>
+          <w:p>
+            <w:pPr>
+              <w:pStyle w:val="Compact"/>
+            </w:pPr>
+            <w:r>
+              <w:t xml:space="preserve">R</w:t>
+            </w:r>
+          </w:p>
+        </w:tc>
+        <w:tc>
+          <w:tcPr/>
+          <w:p>
+            <w:pPr>
+              <w:pStyle w:val="Compact"/>
+            </w:pPr>
+            <w:r>
+              <w:t xml:space="preserve">R</w:t>
+            </w:r>
+          </w:p>
+        </w:tc>
+        <w:tc>
+          <w:tcPr/>
+          <w:p>
+            <w:pPr>
+              <w:pStyle w:val="Compact"/>
+            </w:pPr>
+            <w:r>
+              <w:t xml:space="preserve">R</w:t>
+            </w:r>
+          </w:p>
+        </w:tc>
+        <w:tc>
+          <w:tcPr/>
+          <w:p>
+            <w:pPr>
+              <w:pStyle w:val="Compact"/>
+            </w:pPr>
+            <w:r>
+              <w:t xml:space="preserve">R</w:t>
+            </w:r>
+          </w:p>
+        </w:tc>
+        <w:tc>
+          <w:tcPr/>
+          <w:p>
+            <w:pPr>
+              <w:pStyle w:val="Compact"/>
+            </w:pPr>
+            <w:r>
+              <w:t xml:space="preserve">R</w:t>
+            </w:r>
+          </w:p>
+        </w:tc>
+        <w:tc>
+          <w:tcPr/>
+          <w:p>
+            <w:pPr>
+              <w:pStyle w:val="Compact"/>
+            </w:pPr>
+            <w:r>
+              <w:t xml:space="preserve">R</w:t>
+            </w:r>
+          </w:p>
+        </w:tc>
+        <w:tc>
+          <w:tcPr/>
+          <w:p>
+            <w:pPr>
+              <w:pStyle w:val="Compact"/>
+            </w:pPr>
+            <w:r>
+              <w:t xml:space="preserve">R</w:t>
+            </w:r>
+          </w:p>
+        </w:tc>
+        <w:tc>
+          <w:tcPr/>
+          <w:p>
+            <w:pPr>
+              <w:pStyle w:val="Compact"/>
+            </w:pPr>
+          </w:p>
+        </w:tc>
+      </w:tr>
+      <w:tr>
+        <w:tc>
+          <w:tcPr/>
+          <w:p>
+            <w:pPr>
+              <w:pStyle w:val="Compact"/>
+            </w:pPr>
+            <w:r>
+              <w:t xml:space="preserve">created_at</w:t>
             </w:r>
           </w:p>
         </w:tc>

</xml_diff>